<commit_message>
Update README and user guide for recent feature work
README: document half-day leave, employee document compliance
reminders, the Resignation workflow, and Probation Review; fix the
Approval workflow section's stale "five modules" claim (now seven,
including the project_manager approver type); note the shared
employee-picker.js searchable-dropdown pattern.

User guide: add matching end-user sections for Resignation, Document
Compliance, Probation Review, and half-day leave. Also fixes a
pre-existing bug where two numbered step-lists (Job Requisitions,
Applying for leave) shared one Word list counter and rendered as
steps 5-7 and 8-11 instead of both starting at 1.

Co-Authored-By: Claude Sonnet 5 <noreply@anthropic.com>
</commit_message>
<xml_diff>
--- a/docs/EMS_Onboarding_and_User_Guide.docx
+++ b/docs/EMS_Onboarding_and_User_Guide.docx
@@ -2852,6 +2852,26 @@
     </w:p>
     <w:p>
       <w:pPr>
+        <w:pBdr>
+          <w:left w:val="single" w:color="1D4ED8" w:sz="18" w:space="8"/>
+        </w:pBdr>
+        <w:shd w:fill="EFF6FF" w:val="clear"/>
+        <w:spacing w:after="200" w:before="100"/>
+      </w:pPr>
+      <w:r>
+        <w:rPr>
+          <w:b/>
+          <w:bCs/>
+          <w:color w:val="1D4ED8"/>
+        </w:rPr>
+        <w:t xml:space="preserve">Note:  </w:t>
+      </w:r>
+      <w:r>
+        <w:t xml:space="preserve">HR can also opt a specific employee's checklist into “Probation Review” (a checkbox at Start Onboarding, or added later from an in-progress checklist) — this automatically creates three Performance review cycles for that employee, one each for Month 1, 2, and 3, reusing the same Goals &amp; Appraisal flow described under Performance below. Only HR can see whether a given employee is on probation — a manager or anyone else viewing that employee's record cannot.</w:t>
+      </w:r>
+    </w:p>
+    <w:p>
+      <w:pPr>
         <w:pStyle w:val="Heading2"/>
       </w:pPr>
       <w:r>
@@ -2936,6 +2956,94 @@
     </w:p>
     <w:p>
       <w:pPr>
+        <w:pStyle w:val="Heading2"/>
+      </w:pPr>
+      <w:r>
+        <w:t xml:space="preserve">9.6  Resignation</w:t>
+      </w:r>
+    </w:p>
+    <w:p>
+      <w:pPr>
+        <w:spacing w:after="160"/>
+      </w:pPr>
+      <w:r>
+        <w:t xml:space="preserve">Employees can file their own resignation from the Home dashboard (a “Resign” button); HR can also file one on an employee's behalf from the Employee detail view. A request captures a reason, an effective date (defaults to today), and a required last working day — kept separate from the effective date to account for a notice period — plus an optional resignation letter.</w:t>
+      </w:r>
+    </w:p>
+    <w:p>
+      <w:pPr>
+        <w:spacing w:after="160"/>
+      </w:pPr>
+      <w:r>
+        <w:t xml:space="preserve">Like Leave and Timesheet, a resignation request routes through your institution's configured approval chain (default: Direct Manager → HR Manager — see Settings → Approval Workflows). Once it clears every step, the employee's record is stamped with the resignation and last working dates, and an Offboarding checklist is started automatically from your default Offboarding template — there's no separate step to start it by hand.</w:t>
+      </w:r>
+    </w:p>
+    <w:p>
+      <w:pPr>
+        <w:pBdr>
+          <w:left w:val="single" w:color="1D4ED8" w:sz="18" w:space="8"/>
+        </w:pBdr>
+        <w:shd w:fill="EFF6FF" w:val="clear"/>
+        <w:spacing w:after="200" w:before="100"/>
+      </w:pPr>
+      <w:r>
+        <w:rPr>
+          <w:b/>
+          <w:bCs/>
+          <w:color w:val="1D4ED8"/>
+        </w:rPr>
+        <w:t xml:space="preserve">Note:  </w:t>
+      </w:r>
+      <w:r>
+        <w:t xml:space="preserve">Filing a resignation doesn't change the employee's status by itself — HR still deactivates the record manually once the last working day has passed, the same as any other exit handled through Offboarding.</w:t>
+      </w:r>
+    </w:p>
+    <w:p>
+      <w:pPr>
+        <w:pStyle w:val="Heading2"/>
+      </w:pPr>
+      <w:r>
+        <w:t xml:space="preserve">9.7  Document Compliance</w:t>
+      </w:r>
+    </w:p>
+    <w:p>
+      <w:pPr>
+        <w:spacing w:after="160"/>
+      </w:pPr>
+      <w:r>
+        <w:t xml:space="preserve">Track time-sensitive documents per employee — a foreign employee's work permit renewal, a passport nearing expiry, or anything else HR wants a reminder for. Configure the document types your institution tracks from Settings → Document Types, each with its own reminder window (e.g. start warning 60 days before a work permit expires, 90 days for a passport).</w:t>
+      </w:r>
+    </w:p>
+    <w:p>
+      <w:pPr>
+        <w:spacing w:after="160"/>
+      </w:pPr>
+      <w:r>
+        <w:t xml:space="preserve">From an employee's detail view, open the Documents tab to add or renew a tracked document — pick the type, enter the expiry date (optionally a document number and a scanned copy), and save. There's no separate “renew” step: editing the same document's expiry date updates it in place.</w:t>
+      </w:r>
+    </w:p>
+    <w:p>
+      <w:pPr>
+        <w:pBdr>
+          <w:left w:val="single" w:color="1D4ED8" w:sz="18" w:space="8"/>
+        </w:pBdr>
+        <w:shd w:fill="EFF6FF" w:val="clear"/>
+        <w:spacing w:after="200" w:before="100"/>
+      </w:pPr>
+      <w:r>
+        <w:rPr>
+          <w:b/>
+          <w:bCs/>
+          <w:color w:val="1D4ED8"/>
+        </w:rPr>
+        <w:t xml:space="preserve">Note:  </w:t>
+      </w:r>
+      <w:r>
+        <w:t xml:space="preserve">Upcoming and overdue documents show up two ways: a count on the Home dashboard's To-Do list, and colour-coded entries directly on the Leave monthly calendar (visible from Home or from Leave) — amber for expiring soon, red for already overdue. This is visible to HR roles only.</w:t>
+      </w:r>
+    </w:p>
+    <w:p>
+      <w:pPr>
         <w:pStyle w:val="Heading1"/>
       </w:pPr>
       <w:r>
@@ -2963,7 +3071,7 @@
         <w:pStyle w:val="ListParagraph"/>
         <w:numPr>
           <w:ilvl w:val="0"/>
-          <w:numId w:val="3"/>
+          <w:numId w:val="5"/>
         </w:numPr>
         <w:spacing w:after="80"/>
       </w:pPr>
@@ -2976,7 +3084,7 @@
         <w:pStyle w:val="ListParagraph"/>
         <w:numPr>
           <w:ilvl w:val="0"/>
-          <w:numId w:val="3"/>
+          <w:numId w:val="5"/>
         </w:numPr>
         <w:spacing w:after="80"/>
       </w:pPr>
@@ -2989,7 +3097,7 @@
         <w:pStyle w:val="ListParagraph"/>
         <w:numPr>
           <w:ilvl w:val="0"/>
-          <w:numId w:val="3"/>
+          <w:numId w:val="5"/>
         </w:numPr>
         <w:spacing w:after="80"/>
       </w:pPr>
@@ -3582,7 +3690,7 @@
         <w:pStyle w:val="ListParagraph"/>
         <w:numPr>
           <w:ilvl w:val="0"/>
-          <w:numId w:val="3"/>
+          <w:numId w:val="6"/>
         </w:numPr>
         <w:spacing w:after="80"/>
       </w:pPr>
@@ -3595,7 +3703,7 @@
         <w:pStyle w:val="ListParagraph"/>
         <w:numPr>
           <w:ilvl w:val="0"/>
-          <w:numId w:val="3"/>
+          <w:numId w:val="6"/>
         </w:numPr>
         <w:spacing w:after="80"/>
       </w:pPr>
@@ -3608,7 +3716,7 @@
         <w:pStyle w:val="ListParagraph"/>
         <w:numPr>
           <w:ilvl w:val="0"/>
-          <w:numId w:val="3"/>
+          <w:numId w:val="6"/>
         </w:numPr>
         <w:spacing w:after="80"/>
       </w:pPr>
@@ -3621,7 +3729,7 @@
         <w:pStyle w:val="ListParagraph"/>
         <w:numPr>
           <w:ilvl w:val="0"/>
-          <w:numId w:val="3"/>
+          <w:numId w:val="6"/>
         </w:numPr>
         <w:spacing w:after="80"/>
       </w:pPr>
@@ -3767,6 +3875,26 @@
     </w:p>
     <w:p>
       <w:pPr>
+        <w:pBdr>
+          <w:left w:val="single" w:color="1D4ED8" w:sz="18" w:space="8"/>
+        </w:pBdr>
+        <w:shd w:fill="EFF6FF" w:val="clear"/>
+        <w:spacing w:after="200" w:before="100"/>
+      </w:pPr>
+      <w:r>
+        <w:rPr>
+          <w:b/>
+          <w:bCs/>
+          <w:color w:val="1D4ED8"/>
+        </w:rPr>
+        <w:t xml:space="preserve">Note:  </w:t>
+      </w:r>
+      <w:r>
+        <w:t xml:space="preserve">For a leave type that allows it, the Start Date and/or End Date of an application can each be marked as a half-day (morning or afternoon) instead of a full day — the Start Day / End Day options appear on the form as soon as an eligible leave type is selected.</w:t>
+      </w:r>
+    </w:p>
+    <w:p>
+      <w:pPr>
         <w:pStyle w:val="Heading2"/>
       </w:pPr>
       <w:r>
@@ -3866,7 +3994,7 @@
         <w:t xml:space="preserve">Note:  </w:t>
       </w:r>
       <w:r>
-        <w:t xml:space="preserve">Leave types and the public holiday calendar are configured once, institution-wide, from Leave → Public Holidays (see Part 1, Step 5).</w:t>
+        <w:t xml:space="preserve">Leave types and the public holiday calendar are configured once, institution-wide, from Leave → Public Holidays (see Part 1, Step 5). Each leave type also has its own “Allow half-day” toggle there, controlling whether the half-day option above is offered for that type.</w:t>
       </w:r>
     </w:p>
     <w:p>
@@ -5235,6 +5363,24 @@
     </w:lvlOverride>
   </w:num>
   <w:num w:numId="3">
+    <w:abstractNumId w:val="3"/>
+    <w:lvlOverride w:ilvl="0">
+      <w:startOverride w:val="1"/>
+    </w:lvlOverride>
+  </w:num>
+  <w:num w:numId="5">
+    <w:abstractNumId w:val="3"/>
+    <w:lvlOverride w:ilvl="0">
+      <w:startOverride w:val="1"/>
+    </w:lvlOverride>
+  </w:num>
+  <w:num w:numId="6">
+    <w:abstractNumId w:val="3"/>
+    <w:lvlOverride w:ilvl="0">
+      <w:startOverride w:val="1"/>
+    </w:lvlOverride>
+  </w:num>
+  <w:num w:numId="7">
     <w:abstractNumId w:val="3"/>
     <w:lvlOverride w:ilvl="0">
       <w:startOverride w:val="1"/>

</xml_diff>